<commit_message>
agregando documentacion de base de datos y diagramas UML
</commit_message>
<xml_diff>
--- a/backend/documentacion/Modelado de bases de datos.docx
+++ b/backend/documentacion/Modelado de bases de datos.docx
@@ -1,6 +1,6 @@
 
 <file path=word/document.xml><?xml version="1.0" encoding="utf-8"?>
-<w:document xmlns:wpc="http://schemas.microsoft.com/office/word/2010/wordprocessingCanvas" xmlns:cx="http://schemas.microsoft.com/office/drawing/2014/chartex" xmlns:cx1="http://schemas.microsoft.com/office/drawing/2015/9/8/chartex" xmlns:cx2="http://schemas.microsoft.com/office/drawing/2015/10/21/chartex" xmlns:cx3="http://schemas.microsoft.com/office/drawing/2016/5/9/chartex" xmlns:cx4="http://schemas.microsoft.com/office/drawing/2016/5/10/chartex" xmlns:cx5="http://schemas.microsoft.com/office/drawing/2016/5/11/chartex" xmlns:cx6="http://schemas.microsoft.com/office/drawing/2016/5/12/chartex" xmlns:cx7="http://schemas.microsoft.com/office/drawing/2016/5/13/chartex" xmlns:cx8="http://schemas.microsoft.com/office/drawing/2016/5/14/chartex" xmlns:mc="http://schemas.openxmlformats.org/markup-compatibility/2006" xmlns:aink="http://schemas.microsoft.com/office/drawing/2016/ink" xmlns:am3d="http://schemas.microsoft.com/office/drawing/2017/model3d" xmlns:o="urn:schemas-microsoft-com:office:office" xmlns:oel="http://schemas.microsoft.com/office/2019/extlst" xmlns:r="http://schemas.openxmlformats.org/officeDocument/2006/relationships" xmlns:m="http://schemas.openxmlformats.org/officeDocument/2006/math" xmlns:v="urn:schemas-microsoft-com:vml" xmlns:wp14="http://schemas.microsoft.com/office/word/2010/wordprocessingDrawing" xmlns:wp="http://schemas.openxmlformats.org/drawingml/2006/wordprocessingDrawing" xmlns:w10="urn:schemas-microsoft-com:office:word" xmlns:w="http://schemas.openxmlformats.org/wordprocessingml/2006/main" xmlns:w14="http://schemas.microsoft.com/office/word/2010/wordml" xmlns:w15="http://schemas.microsoft.com/office/word/2012/wordml" xmlns:w16cex="http://schemas.microsoft.com/office/word/2018/wordml/cex" xmlns:w16cid="http://schemas.microsoft.com/office/word/2016/wordml/cid" xmlns:w16="http://schemas.microsoft.com/office/word/2018/wordml" xmlns:w16sdtdh="http://schemas.microsoft.com/office/word/2020/wordml/sdtdatahash" xmlns:w16se="http://schemas.microsoft.com/office/word/2015/wordml/symex" xmlns:wpg="http://schemas.microsoft.com/office/word/2010/wordprocessingGroup" xmlns:wpi="http://schemas.microsoft.com/office/word/2010/wordprocessingInk" xmlns:wne="http://schemas.microsoft.com/office/word/2006/wordml" xmlns:wps="http://schemas.microsoft.com/office/word/2010/wordprocessingShape" mc:Ignorable="w14 w15 w16se w16cid w16 w16cex w16sdtdh wp14">
+<w:document xmlns:wpc="http://schemas.microsoft.com/office/word/2010/wordprocessingCanvas" xmlns:cx="http://schemas.microsoft.com/office/drawing/2014/chartex" xmlns:cx1="http://schemas.microsoft.com/office/drawing/2015/9/8/chartex" xmlns:cx2="http://schemas.microsoft.com/office/drawing/2015/10/21/chartex" xmlns:cx3="http://schemas.microsoft.com/office/drawing/2016/5/9/chartex" xmlns:cx4="http://schemas.microsoft.com/office/drawing/2016/5/10/chartex" xmlns:cx5="http://schemas.microsoft.com/office/drawing/2016/5/11/chartex" xmlns:cx6="http://schemas.microsoft.com/office/drawing/2016/5/12/chartex" xmlns:cx7="http://schemas.microsoft.com/office/drawing/2016/5/13/chartex" xmlns:cx8="http://schemas.microsoft.com/office/drawing/2016/5/14/chartex" xmlns:mc="http://schemas.openxmlformats.org/markup-compatibility/2006" xmlns:aink="http://schemas.microsoft.com/office/drawing/2016/ink" xmlns:am3d="http://schemas.microsoft.com/office/drawing/2017/model3d" xmlns:o="urn:schemas-microsoft-com:office:office" xmlns:oel="http://schemas.microsoft.com/office/2019/extlst" xmlns:r="http://schemas.openxmlformats.org/officeDocument/2006/relationships" xmlns:m="http://schemas.openxmlformats.org/officeDocument/2006/math" xmlns:v="urn:schemas-microsoft-com:vml" xmlns:wp14="http://schemas.microsoft.com/office/word/2010/wordprocessingDrawing" xmlns:wp="http://schemas.openxmlformats.org/drawingml/2006/wordprocessingDrawing" xmlns:w10="urn:schemas-microsoft-com:office:word" xmlns:w="http://schemas.openxmlformats.org/wordprocessingml/2006/main" xmlns:w14="http://schemas.microsoft.com/office/word/2010/wordml" xmlns:w15="http://schemas.microsoft.com/office/word/2012/wordml" xmlns:w16cex="http://schemas.microsoft.com/office/word/2018/wordml/cex" xmlns:w16cid="http://schemas.microsoft.com/office/word/2016/wordml/cid" xmlns:w16="http://schemas.microsoft.com/office/word/2018/wordml" xmlns:w16du="http://schemas.microsoft.com/office/word/2023/wordml/word16du" xmlns:w16sdtdh="http://schemas.microsoft.com/office/word/2020/wordml/sdtdatahash" xmlns:w16se="http://schemas.microsoft.com/office/word/2015/wordml/symex" xmlns:wpg="http://schemas.microsoft.com/office/word/2010/wordprocessingGroup" xmlns:wpi="http://schemas.microsoft.com/office/word/2010/wordprocessingInk" xmlns:wne="http://schemas.microsoft.com/office/word/2006/wordml" xmlns:wps="http://schemas.microsoft.com/office/word/2010/wordprocessingShape" mc:Ignorable="w14 w15 w16se w16cid w16 w16cex w16sdtdh w16du wp14">
   <w:body>
     <w:p>
       <w:pPr>
@@ -283,26 +283,26 @@
           <w:lang w:val="es-ES"/>
         </w:rPr>
         <w:drawing>
-          <wp:anchor distT="0" distB="0" distL="114300" distR="114300" simplePos="0" relativeHeight="251656192" behindDoc="1" locked="0" layoutInCell="1" allowOverlap="1" wp14:anchorId="2DE1D407" wp14:editId="019C4338">
+          <wp:anchor distT="0" distB="0" distL="114300" distR="114300" simplePos="0" relativeHeight="251660288" behindDoc="1" locked="0" layoutInCell="1" allowOverlap="1" wp14:anchorId="7020D657" wp14:editId="5688F93D">
             <wp:simplePos x="0" y="0"/>
             <wp:positionH relativeFrom="column">
-              <wp:posOffset>-304</wp:posOffset>
+              <wp:posOffset>203200</wp:posOffset>
             </wp:positionH>
             <wp:positionV relativeFrom="paragraph">
-              <wp:posOffset>316782</wp:posOffset>
+              <wp:posOffset>328930</wp:posOffset>
             </wp:positionV>
-            <wp:extent cx="5734050" cy="3759200"/>
-            <wp:effectExtent l="0" t="0" r="0" b="0"/>
+            <wp:extent cx="5734050" cy="3615055"/>
+            <wp:effectExtent l="0" t="0" r="0" b="4445"/>
             <wp:wrapTight wrapText="bothSides">
               <wp:wrapPolygon edited="0">
                 <wp:start x="0" y="0"/>
-                <wp:lineTo x="0" y="21454"/>
-                <wp:lineTo x="21528" y="21454"/>
+                <wp:lineTo x="0" y="21513"/>
+                <wp:lineTo x="21528" y="21513"/>
                 <wp:lineTo x="21528" y="0"/>
                 <wp:lineTo x="0" y="0"/>
               </wp:wrapPolygon>
             </wp:wrapTight>
-            <wp:docPr id="1180615233" name="Imagen 1"/>
+            <wp:docPr id="1534839016" name="Imagen 1"/>
             <wp:cNvGraphicFramePr>
               <a:graphicFrameLocks xmlns:a="http://schemas.openxmlformats.org/drawingml/2006/main" noChangeAspect="1"/>
             </wp:cNvGraphicFramePr>
@@ -310,7 +310,7 @@
               <a:graphicData uri="http://schemas.openxmlformats.org/drawingml/2006/picture">
                 <pic:pic xmlns:pic="http://schemas.openxmlformats.org/drawingml/2006/picture">
                   <pic:nvPicPr>
-                    <pic:cNvPr id="1180615233" name="Imagen 1180615233"/>
+                    <pic:cNvPr id="1534839016" name="Imagen 1534839016"/>
                     <pic:cNvPicPr/>
                   </pic:nvPicPr>
                   <pic:blipFill>
@@ -328,7 +328,7 @@
                   <pic:spPr>
                     <a:xfrm>
                       <a:off x="0" y="0"/>
-                      <a:ext cx="5734050" cy="3759200"/>
+                      <a:ext cx="5734050" cy="3615055"/>
                     </a:xfrm>
                     <a:prstGeom prst="rect">
                       <a:avLst/>
@@ -375,26 +375,26 @@
           <w:lang w:val="es-ES"/>
         </w:rPr>
         <w:drawing>
-          <wp:anchor distT="0" distB="0" distL="114300" distR="114300" simplePos="0" relativeHeight="251658240" behindDoc="1" locked="0" layoutInCell="1" allowOverlap="1" wp14:anchorId="0B5C2959" wp14:editId="57E8FEA8">
+          <wp:anchor distT="0" distB="0" distL="114300" distR="114300" simplePos="0" relativeHeight="251661312" behindDoc="1" locked="0" layoutInCell="1" allowOverlap="1" wp14:anchorId="63442FE5" wp14:editId="62E3E4B2">
             <wp:simplePos x="0" y="0"/>
-            <wp:positionH relativeFrom="column">
-              <wp:posOffset>-304</wp:posOffset>
+            <wp:positionH relativeFrom="margin">
+              <wp:posOffset>-260985</wp:posOffset>
             </wp:positionH>
             <wp:positionV relativeFrom="paragraph">
-              <wp:posOffset>441491</wp:posOffset>
+              <wp:posOffset>451485</wp:posOffset>
             </wp:positionV>
-            <wp:extent cx="5734050" cy="3012440"/>
-            <wp:effectExtent l="0" t="0" r="0" b="0"/>
+            <wp:extent cx="6395720" cy="2717800"/>
+            <wp:effectExtent l="0" t="0" r="5080" b="6350"/>
             <wp:wrapTight wrapText="bothSides">
               <wp:wrapPolygon edited="0">
                 <wp:start x="0" y="0"/>
-                <wp:lineTo x="0" y="21445"/>
-                <wp:lineTo x="21528" y="21445"/>
-                <wp:lineTo x="21528" y="0"/>
+                <wp:lineTo x="0" y="21499"/>
+                <wp:lineTo x="21553" y="21499"/>
+                <wp:lineTo x="21553" y="0"/>
                 <wp:lineTo x="0" y="0"/>
               </wp:wrapPolygon>
             </wp:wrapTight>
-            <wp:docPr id="1608110811" name="Imagen 2"/>
+            <wp:docPr id="1453490741" name="Imagen 2"/>
             <wp:cNvGraphicFramePr>
               <a:graphicFrameLocks xmlns:a="http://schemas.openxmlformats.org/drawingml/2006/main" noChangeAspect="1"/>
             </wp:cNvGraphicFramePr>
@@ -402,7 +402,7 @@
               <a:graphicData uri="http://schemas.openxmlformats.org/drawingml/2006/picture">
                 <pic:pic xmlns:pic="http://schemas.openxmlformats.org/drawingml/2006/picture">
                   <pic:nvPicPr>
-                    <pic:cNvPr id="1608110811" name="Imagen 1608110811"/>
+                    <pic:cNvPr id="1453490741" name="Imagen 1453490741"/>
                     <pic:cNvPicPr/>
                   </pic:nvPicPr>
                   <pic:blipFill>
@@ -420,7 +420,7 @@
                   <pic:spPr>
                     <a:xfrm>
                       <a:off x="0" y="0"/>
-                      <a:ext cx="5734050" cy="3012440"/>
+                      <a:ext cx="6395720" cy="2717800"/>
                     </a:xfrm>
                     <a:prstGeom prst="rect">
                       <a:avLst/>
@@ -429,6 +429,12 @@
                 </pic:pic>
               </a:graphicData>
             </a:graphic>
+            <wp14:sizeRelH relativeFrom="margin">
+              <wp14:pctWidth>0</wp14:pctWidth>
+            </wp14:sizeRelH>
+            <wp14:sizeRelV relativeFrom="margin">
+              <wp14:pctHeight>0</wp14:pctHeight>
+            </wp14:sizeRelV>
           </wp:anchor>
         </w:drawing>
       </w:r>
@@ -442,6 +448,16 @@
     <w:p>
       <w:pPr>
         <w:pStyle w:val="Prrafodelista"/>
+        <w:rPr>
+          <w:lang w:val="es-ES"/>
+        </w:rPr>
+      </w:pPr>
+    </w:p>
+    <w:p>
+      <w:pPr>
+        <w:pStyle w:val="Prrafodelista"/>
+        <w:ind w:left="1429" w:firstLine="0"/>
+        <w:jc w:val="both"/>
         <w:rPr>
           <w:lang w:val="es-ES"/>
         </w:rPr>
@@ -471,30 +487,47 @@
       </w:pPr>
       <w:r>
         <w:rPr>
+          <w:lang w:val="es-ES"/>
+        </w:rPr>
+        <w:lastRenderedPageBreak/>
+        <w:t>Modelo físico:</w:t>
+      </w:r>
+    </w:p>
+    <w:p>
+      <w:pPr>
+        <w:pStyle w:val="Prrafodelista"/>
+        <w:ind w:left="1429" w:firstLine="0"/>
+        <w:jc w:val="both"/>
+        <w:rPr>
+          <w:lang w:val="es-ES"/>
+        </w:rPr>
+      </w:pPr>
+      <w:r>
+        <w:rPr>
           <w:noProof/>
           <w:lang w:val="es-ES"/>
         </w:rPr>
         <w:drawing>
-          <wp:anchor distT="0" distB="0" distL="114300" distR="114300" simplePos="0" relativeHeight="251659264" behindDoc="1" locked="0" layoutInCell="1" allowOverlap="1" wp14:anchorId="4E7D96E6" wp14:editId="2F652FD6">
+          <wp:anchor distT="0" distB="0" distL="114300" distR="114300" simplePos="0" relativeHeight="251662336" behindDoc="1" locked="0" layoutInCell="1" allowOverlap="1" wp14:anchorId="7D6DE3BA" wp14:editId="5590E499">
             <wp:simplePos x="0" y="0"/>
-            <wp:positionH relativeFrom="column">
-              <wp:posOffset>-221</wp:posOffset>
+            <wp:positionH relativeFrom="margin">
+              <wp:align>right</wp:align>
             </wp:positionH>
             <wp:positionV relativeFrom="paragraph">
-              <wp:posOffset>348035</wp:posOffset>
+              <wp:posOffset>139700</wp:posOffset>
             </wp:positionV>
-            <wp:extent cx="5734050" cy="3336290"/>
+            <wp:extent cx="5550185" cy="4864350"/>
             <wp:effectExtent l="0" t="0" r="0" b="0"/>
             <wp:wrapTight wrapText="bothSides">
               <wp:wrapPolygon edited="0">
                 <wp:start x="0" y="0"/>
-                <wp:lineTo x="0" y="21460"/>
-                <wp:lineTo x="21528" y="21460"/>
-                <wp:lineTo x="21528" y="0"/>
+                <wp:lineTo x="0" y="21487"/>
+                <wp:lineTo x="21501" y="21487"/>
+                <wp:lineTo x="21501" y="0"/>
                 <wp:lineTo x="0" y="0"/>
               </wp:wrapPolygon>
             </wp:wrapTight>
-            <wp:docPr id="71754033" name="Imagen 3"/>
+            <wp:docPr id="360273907" name="Imagen 3"/>
             <wp:cNvGraphicFramePr>
               <a:graphicFrameLocks xmlns:a="http://schemas.openxmlformats.org/drawingml/2006/main" noChangeAspect="1"/>
             </wp:cNvGraphicFramePr>
@@ -502,7 +535,7 @@
               <a:graphicData uri="http://schemas.openxmlformats.org/drawingml/2006/picture">
                 <pic:pic xmlns:pic="http://schemas.openxmlformats.org/drawingml/2006/picture">
                   <pic:nvPicPr>
-                    <pic:cNvPr id="71754033" name="Imagen 71754033"/>
+                    <pic:cNvPr id="360273907" name="Imagen 360273907"/>
                     <pic:cNvPicPr/>
                   </pic:nvPicPr>
                   <pic:blipFill>
@@ -520,7 +553,7 @@
                   <pic:spPr>
                     <a:xfrm>
                       <a:off x="0" y="0"/>
-                      <a:ext cx="5734050" cy="3336290"/>
+                      <a:ext cx="5550185" cy="4864350"/>
                     </a:xfrm>
                     <a:prstGeom prst="rect">
                       <a:avLst/>
@@ -532,22 +565,6 @@
           </wp:anchor>
         </w:drawing>
       </w:r>
-      <w:r>
-        <w:rPr>
-          <w:lang w:val="es-ES"/>
-        </w:rPr>
-        <w:t>Modelo físico:</w:t>
-      </w:r>
-    </w:p>
-    <w:p>
-      <w:pPr>
-        <w:pStyle w:val="Prrafodelista"/>
-        <w:ind w:left="1429" w:firstLine="0"/>
-        <w:jc w:val="both"/>
-        <w:rPr>
-          <w:lang w:val="es-ES"/>
-        </w:rPr>
-      </w:pPr>
     </w:p>
     <w:sectPr>
       <w:type w:val="continuous"/>
@@ -561,7 +578,7 @@
 </file>
 
 <file path=word/numbering.xml><?xml version="1.0" encoding="utf-8"?>
-<w:numbering xmlns:wpc="http://schemas.microsoft.com/office/word/2010/wordprocessingCanvas" xmlns:cx="http://schemas.microsoft.com/office/drawing/2014/chartex" xmlns:cx1="http://schemas.microsoft.com/office/drawing/2015/9/8/chartex" xmlns:cx2="http://schemas.microsoft.com/office/drawing/2015/10/21/chartex" xmlns:cx3="http://schemas.microsoft.com/office/drawing/2016/5/9/chartex" xmlns:cx4="http://schemas.microsoft.com/office/drawing/2016/5/10/chartex" xmlns:cx5="http://schemas.microsoft.com/office/drawing/2016/5/11/chartex" xmlns:cx6="http://schemas.microsoft.com/office/drawing/2016/5/12/chartex" xmlns:cx7="http://schemas.microsoft.com/office/drawing/2016/5/13/chartex" xmlns:cx8="http://schemas.microsoft.com/office/drawing/2016/5/14/chartex" xmlns:mc="http://schemas.openxmlformats.org/markup-compatibility/2006" xmlns:aink="http://schemas.microsoft.com/office/drawing/2016/ink" xmlns:am3d="http://schemas.microsoft.com/office/drawing/2017/model3d" xmlns:o="urn:schemas-microsoft-com:office:office" xmlns:oel="http://schemas.microsoft.com/office/2019/extlst" xmlns:r="http://schemas.openxmlformats.org/officeDocument/2006/relationships" xmlns:m="http://schemas.openxmlformats.org/officeDocument/2006/math" xmlns:v="urn:schemas-microsoft-com:vml" xmlns:wp14="http://schemas.microsoft.com/office/word/2010/wordprocessingDrawing" xmlns:wp="http://schemas.openxmlformats.org/drawingml/2006/wordprocessingDrawing" xmlns:w10="urn:schemas-microsoft-com:office:word" xmlns:w="http://schemas.openxmlformats.org/wordprocessingml/2006/main" xmlns:w14="http://schemas.microsoft.com/office/word/2010/wordml" xmlns:w15="http://schemas.microsoft.com/office/word/2012/wordml" xmlns:w16cex="http://schemas.microsoft.com/office/word/2018/wordml/cex" xmlns:w16cid="http://schemas.microsoft.com/office/word/2016/wordml/cid" xmlns:w16="http://schemas.microsoft.com/office/word/2018/wordml" xmlns:w16sdtdh="http://schemas.microsoft.com/office/word/2020/wordml/sdtdatahash" xmlns:w16se="http://schemas.microsoft.com/office/word/2015/wordml/symex" xmlns:wpg="http://schemas.microsoft.com/office/word/2010/wordprocessingGroup" xmlns:wpi="http://schemas.microsoft.com/office/word/2010/wordprocessingInk" xmlns:wne="http://schemas.microsoft.com/office/word/2006/wordml" xmlns:wps="http://schemas.microsoft.com/office/word/2010/wordprocessingShape" mc:Ignorable="w14 w15 w16se w16cid w16 w16cex w16sdtdh wp14">
+<w:numbering xmlns:wpc="http://schemas.microsoft.com/office/word/2010/wordprocessingCanvas" xmlns:cx="http://schemas.microsoft.com/office/drawing/2014/chartex" xmlns:cx1="http://schemas.microsoft.com/office/drawing/2015/9/8/chartex" xmlns:cx2="http://schemas.microsoft.com/office/drawing/2015/10/21/chartex" xmlns:cx3="http://schemas.microsoft.com/office/drawing/2016/5/9/chartex" xmlns:cx4="http://schemas.microsoft.com/office/drawing/2016/5/10/chartex" xmlns:cx5="http://schemas.microsoft.com/office/drawing/2016/5/11/chartex" xmlns:cx6="http://schemas.microsoft.com/office/drawing/2016/5/12/chartex" xmlns:cx7="http://schemas.microsoft.com/office/drawing/2016/5/13/chartex" xmlns:cx8="http://schemas.microsoft.com/office/drawing/2016/5/14/chartex" xmlns:mc="http://schemas.openxmlformats.org/markup-compatibility/2006" xmlns:aink="http://schemas.microsoft.com/office/drawing/2016/ink" xmlns:am3d="http://schemas.microsoft.com/office/drawing/2017/model3d" xmlns:o="urn:schemas-microsoft-com:office:office" xmlns:oel="http://schemas.microsoft.com/office/2019/extlst" xmlns:r="http://schemas.openxmlformats.org/officeDocument/2006/relationships" xmlns:m="http://schemas.openxmlformats.org/officeDocument/2006/math" xmlns:v="urn:schemas-microsoft-com:vml" xmlns:wp14="http://schemas.microsoft.com/office/word/2010/wordprocessingDrawing" xmlns:wp="http://schemas.openxmlformats.org/drawingml/2006/wordprocessingDrawing" xmlns:w10="urn:schemas-microsoft-com:office:word" xmlns:w="http://schemas.openxmlformats.org/wordprocessingml/2006/main" xmlns:w14="http://schemas.microsoft.com/office/word/2010/wordml" xmlns:w15="http://schemas.microsoft.com/office/word/2012/wordml" xmlns:w16cex="http://schemas.microsoft.com/office/word/2018/wordml/cex" xmlns:w16cid="http://schemas.microsoft.com/office/word/2016/wordml/cid" xmlns:w16="http://schemas.microsoft.com/office/word/2018/wordml" xmlns:w16du="http://schemas.microsoft.com/office/word/2023/wordml/word16du" xmlns:w16sdtdh="http://schemas.microsoft.com/office/word/2020/wordml/sdtdatahash" xmlns:w16se="http://schemas.microsoft.com/office/word/2015/wordml/symex" xmlns:wpg="http://schemas.microsoft.com/office/word/2010/wordprocessingGroup" xmlns:wpi="http://schemas.microsoft.com/office/word/2010/wordprocessingInk" xmlns:wne="http://schemas.microsoft.com/office/word/2006/wordml" xmlns:wps="http://schemas.microsoft.com/office/word/2010/wordprocessingShape" mc:Ignorable="w14 w15 w16se w16cid w16 w16cex w16sdtdh w16du wp14">
   <w:abstractNum w:abstractNumId="0" w15:restartNumberingAfterBreak="0">
     <w:nsid w:val="029C4D48"/>
     <w:multiLevelType w:val="hybridMultilevel"/>
@@ -798,7 +815,7 @@
 </file>
 
 <file path=word/styles.xml><?xml version="1.0" encoding="utf-8"?>
-<w:styles xmlns:mc="http://schemas.openxmlformats.org/markup-compatibility/2006" xmlns:r="http://schemas.openxmlformats.org/officeDocument/2006/relationships" xmlns:w="http://schemas.openxmlformats.org/wordprocessingml/2006/main" xmlns:w14="http://schemas.microsoft.com/office/word/2010/wordml" xmlns:w15="http://schemas.microsoft.com/office/word/2012/wordml" xmlns:w16cex="http://schemas.microsoft.com/office/word/2018/wordml/cex" xmlns:w16cid="http://schemas.microsoft.com/office/word/2016/wordml/cid" xmlns:w16="http://schemas.microsoft.com/office/word/2018/wordml" xmlns:w16sdtdh="http://schemas.microsoft.com/office/word/2020/wordml/sdtdatahash" xmlns:w16se="http://schemas.microsoft.com/office/word/2015/wordml/symex" mc:Ignorable="w14 w15 w16se w16cid w16 w16cex w16sdtdh">
+<w:styles xmlns:mc="http://schemas.openxmlformats.org/markup-compatibility/2006" xmlns:r="http://schemas.openxmlformats.org/officeDocument/2006/relationships" xmlns:w="http://schemas.openxmlformats.org/wordprocessingml/2006/main" xmlns:w14="http://schemas.microsoft.com/office/word/2010/wordml" xmlns:w15="http://schemas.microsoft.com/office/word/2012/wordml" xmlns:w16cex="http://schemas.microsoft.com/office/word/2018/wordml/cex" xmlns:w16cid="http://schemas.microsoft.com/office/word/2016/wordml/cid" xmlns:w16="http://schemas.microsoft.com/office/word/2018/wordml" xmlns:w16du="http://schemas.microsoft.com/office/word/2023/wordml/word16du" xmlns:w16sdtdh="http://schemas.microsoft.com/office/word/2020/wordml/sdtdatahash" xmlns:w16se="http://schemas.microsoft.com/office/word/2015/wordml/symex" mc:Ignorable="w14 w15 w16se w16cid w16 w16cex w16sdtdh w16du">
   <w:docDefaults>
     <w:rPrDefault>
       <w:rPr>

</xml_diff>